<commit_message>
v436.0.0: Alle Mandatsnotizen ersetzt, Schablonentexte ausgekämmt
- Langgutachten/Vollgutachten in neun Akten fallspezifisch neu gefasst (Holzofen, Smart-Kühlschrank, Batteriespeicher, HGB Altona, Kernfusion, Datenschutz Rhein-Main, Lobbyregister, Private Equity, Verbraucherinsolvenz)
- Gesamt-PDFs neu gebaut, Duplikatanalyse sauber (kein Absatz mehr in fünf oder mehr Akten wortgleich)
- Versions-Bump auf v436.0.0 inkl. plugin.json/marketplace.json, SKILLS.md, ASSET_INDEX, skills-index
- CHANGELOG-Eintrag v436.0.0

Co-Authored-By: Claude Fable 5 <noreply@anthropic.com>
Claude-Session: https://claude.ai/code/session_01YXnmkjavncPDoNYycYaC5G
</commit_message>
<xml_diff>
--- a/testakten/batteriespeicher-brandenburg-berlin-resilienz/14-langgutachten-und-entscheidungsvorlage.docx
+++ b/testakten/batteriespeicher-brandenburg-berlin-resilienz/14-langgutachten-und-entscheidungsvorlage.docx
@@ -29,16 +29,7 @@
         <w:jc w:val="left"/>
       </w:pPr>
       <w:r>
-        <w:t xml:space="preserve">Dieses Aktenstück fasst die bisherigen Unterlagen zum Vorgang </w:t>
-      </w:r>
-      <w:r>
-        <w:rPr>
-          <w:b/>
-        </w:rPr>
-        <w:t>Speicherwerk Oderbruch</w:t>
-      </w:r>
-      <w:r>
-        <w:t xml:space="preserve"> nicht bloß zusammen, sondern arbeitet die entscheidungsfähige Prüfungsfassung aus. Die Akte ist in der bisherigen Form fragmentarisch: Einzelne Mails sind zu knapp, Tabellen enthalten nur Stichworte, und manche Anlagen nennen ein Problem, ohne den rechtlichen Gedankengang auszuführen. Dieses Langgutachten schließt diese Lücke.</w:t>
+        <w:t>Dieses Aktenstück führt die Unterlagen des Vorhabens Märkische Reserve Süd — Batteriespeicherpark auf dem früheren Logistik- und Kiesumschlagplatz südlich von Ludwigsfelde mit 1,8 GW Anschlussleistung und 9,6 GWh Speicherkapazität — zu einer entscheidungsfähigen Prüfungsfassung zusammen. Die Akte ist in ihrer bisherigen Form fragmentarisch: Die Netzanschlussnotiz nennt nur ein Studienangebot, der Kosten- und Zeitplan liegt als Tabelle mit fünf Positionen vor, der Projektteam-Chat vom Juni 2026 dokumentiert Widersprüche in Halbsätzen, und der anwaltliche Memo-Entwurf bricht bei den nächsten Schritten ab. Dieses Langgutachten schließt diese Lücke und bereitet die Gate-2-Entscheidung der Geschäftsführung vor.</w:t>
       </w:r>
     </w:p>
     <w:p>
@@ -57,7 +48,7 @@
         <w:jc w:val="left"/>
       </w:pPr>
       <w:r>
-        <w:t>Der Fall wird entlang folgender Themen bearbeitet: Baurecht, Energierecht, Netzanschluss, Brandschutz, Cybersecurity, KRITIS, Nachbarschaft, Diesel-Backup und Behördenkoordination. Für jedes Thema wird getrennt gefragt, ob es bereits entscheidungsreif ist, ob weitere Tatsachen fehlen oder ob zunächst nur ein Risikovermerk möglich ist.</w:t>
+        <w:t>Der Fall wird entlang folgender Themen bearbeitet: Bauleitplanung für das vorgeschlagene Sondergebiet Energieinfrastruktur, Netzanschluss an die bestehende 380-kV-Trasse, Brandschutz und Havarie für 1.920 Batteriecontainer, Cyber- und KRITIS-Einordnung der Leitwarte in Berlin mit Fernwartung aus Rotterdam, Nachbarschaftskonflikte mit dem Wohngebiet in 620 m Entfernung und dem südlich gelegenen Reiterhof, die acht Dieselgeneratoren samt Emissions- und Betriebszeitenfragen sowie die Koordination von Gemeinde, Bauaufsicht, Kreisbrandmeister, Übertragungsnetzbetreiber und Konsortialbanken. Für jedes Thema wird getrennt gefragt, ob es bereits entscheidungsreif ist, ob weitere Tatsachen fehlen oder ob zunächst nur ein Risikovermerk möglich ist.</w:t>
       </w:r>
     </w:p>
     <w:p>
@@ -76,7 +67,7 @@
         <w:jc w:val="left"/>
       </w:pPr>
       <w:r>
-        <w:t>Die bisherige Akte enthält mehrere Beweistypen. Verwertbar sind Originaldokumente, unterschriebene Entwürfe, Bescheide, Registerauszüge, Vertragsfassungen, Fristnotizen und E-Mails mit erkennbarem Absender. Nur eingeschränkt verwertbar sind spätere Zusammenfassungen, Screenshots ohne Kontext, Gesprächsnotizen ohne Datum und bloße Erinnerungen. Deshalb ist jede rechtliche Schlussfolgerung in diesem Gutachten mit einem Beweistyp verknüpft.</w:t>
+        <w:t>Die Akte enthält mehrere Beweistypen. Verwertbar sind die Beschlussvorlage der Geschäftsführung zur Gate-1-Freigabe über 18,4 Mio. EUR, die E-Mail von Theresia Aldinger vom 02.06.2026 an das Projektteam, das Protokoll des Feuerwehr-Workshops mit Kreisbrandmeister, Bauaufsicht, Hersteller und Versicherer, die Redline-Notiz zum Bank-Term-Sheet sowie der tabellarische Kosten- und Zeitplan mit Beträgen und Fälligkeiten. Nur eingeschränkt verwertbar sind der Projektteam-Chat mit Kurznachrichten zwischen 06:42 Uhr und 07:30 Uhr, die Herstellerpräsentation mit der Formulierung 'Schwarzstart Berlin' und die Datenraumstände ohne Versionsdatum. Deshalb ist jede rechtliche Schlussfolgerung in diesem Gutachten mit einem Beweistyp verknüpft.</w:t>
       </w:r>
     </w:p>
     <w:p>
@@ -84,7 +75,7 @@
         <w:jc w:val="left"/>
       </w:pPr>
       <w:r>
-        <w:t>Der wichtigste Fehler wäre, den Fall schon deshalb als geklärt anzusehen, weil ein Dokument einen prägnanten Titel trägt. Ein Dokument mit der Überschrift „Final“ kann rechtlich unverbindlich sein. Ein E-Mail-Anhang kann überholt sein. Ein Protokoll kann inhaltlich falsch wiedergeben, was beschlossen wurde. Deshalb wird zunächst eine Beweismatrix geführt.</w:t>
+        <w:t>Der wichtigste Fehler wäre, den Fall schon deshalb als geklärt anzusehen, weil ein Dokument einen prägnanten Titel trägt. Die 'Netzverträglichkeitsstudie' ist bislang nur ein Angebot des Übertragungsnetzbetreibers über 875.000 EUR mit Fälligkeit zum 31.07.2026, keine Anschlusszusage. Die Garantiezusage des Herstellers nennt 92 % Verfügbarkeit, klammert aber Wartungsfenster, Netzbetreiberabrufe und sicherheitsbedingte Abschaltungen ausdrücklich aus. Der Entwurf der Gemeinderatsvorlage behauptet, der Speicher sichere die Stromversorgung Berlins für mehrere Tage — eine Aussage, die die Akte nicht deckt. Deshalb wird zunächst eine Beweismatrix geführt.</w:t>
       </w:r>
     </w:p>
     <w:p>
@@ -103,7 +94,7 @@
         <w:jc w:val="left"/>
       </w:pPr>
       <w:r>
-        <w:t>Die Hauptfrage ist nicht, ob das gewünschte Ergebnis wirtschaftlich sinnvoll wäre. Die Hauptfrage lautet, ob die konkrete Handlung auf der vorhandenen Tatsachengrundlage rechtlich trägt. Dafür müssen Zuständigkeit, Form, Frist, materielle Voraussetzungen, Ermessen beziehungsweise Bewertungsspielraum, Dokumentation und Rechtsfolge einzeln geprüft werden.</w:t>
+        <w:t>Die Hauptfrage ist nicht, ob ein Batteriespeicher mit 9,6 GWh wirtschaftlich sinnvoll wäre. Die Hauptfrage lautet, ob die Freigabe für Gate 2 auf der vorhandenen Tatsachengrundlage rechtlich trägt. Dafür müssen Zuständigkeit (Gemeinde für den Bebauungsplan, Bauaufsicht für den Sonderbau, Übertragungsnetzbetreiber für den 380-kV-Anschluss, Immissionsschutzbehörde für die Dieselgeneratoren), Form, Fristen (Ministeriumstermin am 17.06.2026, die von der Gemeinde erbetene Unterlage zu Brandschutz, Verkehr und Gewerbesteuer, Fälligkeit der Grundstückssicherung zum 01.09.2026), materielle Voraussetzungen, Bewertungsspielräume, Dokumentation und Rechtsfolge einzeln geprüft werden.</w:t>
       </w:r>
     </w:p>
     <w:p>
@@ -111,7 +102,7 @@
         <w:jc w:val="left"/>
       </w:pPr>
       <w:r>
-        <w:t>Bei der Prüfung darf die Bearbeitung nicht in eine bloße Checkliste abrutschen. Gerade in dieser Akte hängen mehrere Teilfragen voneinander ab. Eine formal richtige Erklärung kann wertlos sein, wenn sie an die falsche Stelle gerichtet ist. Eine materiell gute Position kann verloren gehen, wenn sie zu spät oder ohne Beleg vorgebracht wird. Eine taktisch attraktive Offenlegung kann schaden, wenn sie ohne Not interne Bewertungen preisgibt.</w:t>
+        <w:t>Bei der Prüfung darf die Bearbeitung nicht in eine bloße Checkliste abrutschen, weil die Teilfragen dieser Akte voneinander abhängen. Das Containerlayout ohne die vom Versicherer geforderten Blockabstände entwertet das Brandschutzkonzept, und ohne Sonderbau-Sicherheitskonzept sieht die Feuerwehr keine belastbare Bauantragslage. Die Fernwartung aus Rotterdam entscheidet über den KRITIS-Scope und damit über das Cyber Undertaking im Bank-Term-Sheet. Und die politisch attraktive Aussage, Berlin könne drei Tage weiteratmen, kann im Beteiligungsverfahren Einwendungen provozieren, die das gesamte Planverfahren belasten.</w:t>
       </w:r>
     </w:p>
     <w:p>
@@ -130,7 +121,7 @@
         <w:jc w:val="left"/>
       </w:pPr>
       <w:r>
-        <w:t>Nach dem derzeitigen Stand spricht vieles dafür, dass mindestens ein rechtlicher Angriffspunkt besteht. Zugleich ist die Verteidigungslinie nicht fertig. Die stärkste Position ergibt sich aus den Unterlagen, die schon vor dem Konflikt entstanden sind. Schwächer sind Dokumente, die erkennbar erst nach dem Streit formuliert wurden.</w:t>
+        <w:t>Nach dem derzeitigen Stand bestehen mindestens zwei rechtliche Angriffspunkte: das fehlende Bauplanungsrecht — der Flächennutzungsplan weist Gewerbe, Logistik und teilweise Landwirtschaft aus, ein Bebauungsplan existiert nicht — und der Netzanschluss, der nur als Vorstudie vorliegt. Zugleich ist die Verteidigungslinie nicht fertig. Die stärkste Position ergibt sich aus den Unterlagen, die vor dem öffentlichen Konflikt entstanden sind: Standort- und Flächenvermerk, Beschlussvorlage Gate 1 und Kostenplan. Schwächer sind Texte, die erkennbar erst nach der Presseanfrage zur Gefährlichkeit von 'fast zweitausend Batteriecontainern neben dem Reiterhof' formuliert wurden.</w:t>
       </w:r>
     </w:p>
     <w:p>
@@ -146,13 +137,7 @@
         <w:pStyle w:val="ListBullet"/>
       </w:pPr>
       <w:r>
-        <w:rPr>
-          <w:b/>
-        </w:rPr>
-        <w:t>sichere Tatsachen:</w:t>
-      </w:r>
-      <w:r>
-        <w:t xml:space="preserve"> Datum, Beteiligte, vorhandene Originale, Zugang, sichtbarer Inhalt;</w:t>
+        <w:t>sichere Tatsachen: Flurstücke 144/3, 144/8 und 145/2 südlich von Ludwigsfelde, Lage an der bestehenden 380-kV-Trasse, Gate-1-Budget von 18,4 Mio. EUR, Grundstückssicherung über 4,2 Mio. EUR mit Fälligkeit 01.09.2026, E-Mail vom 02.06.2026;</w:t>
       </w:r>
     </w:p>
     <w:p>
@@ -160,13 +145,7 @@
         <w:pStyle w:val="ListBullet"/>
       </w:pPr>
       <w:r>
-        <w:rPr>
-          <w:b/>
-        </w:rPr>
-        <w:t>plausible, aber offene Tatsachen:</w:t>
-      </w:r>
-      <w:r>
-        <w:t xml:space="preserve"> interne Freigabe, Gesprächsinhalt, wirtschaftlicher Zweck, tatsächliche Kenntnis;</w:t>
+        <w:t>plausible, aber offene Tatsachen: verbindliche Zellchemie (die Präsentation nennt LFP, die technische Anlage zwei alternative Lieferanten), tatsächliches Derating oberhalb von +38 Grad Celsius, KRITIS-Einstufung der Berliner Leitwarte, Gewerbesteueraufkommen in den ersten Betriebsjahren;</w:t>
       </w:r>
     </w:p>
     <w:p>
@@ -174,13 +153,7 @@
         <w:pStyle w:val="ListBullet"/>
       </w:pPr>
       <w:r>
-        <w:rPr>
-          <w:b/>
-        </w:rPr>
-        <w:t>bloße Bewertungen:</w:t>
-      </w:r>
-      <w:r>
-        <w:t xml:space="preserve"> „üblich“, „unproblematisch“, „nur Formalie“, „hatten wir immer so gemacht“.</w:t>
+        <w:t>bloße Bewertungen: 'Berlin kann drei Tage weiteratmen', 'Löschen ist im Regelfall nicht erforderlich', 'Remote Maintenance aus Rotterdam ist Standard', 'Umwelt machen wir später'.</w:t>
       </w:r>
     </w:p>
     <w:p>
@@ -188,7 +161,7 @@
         <w:jc w:val="left"/>
       </w:pPr>
       <w:r>
-        <w:t>Nur die erste Ebene darf ohne Einschränkung in ein Außenschreiben. Die zweite Ebene kann als Prüfstand dargestellt werden. Die dritte Ebene gehört in die interne Risikodiskussion, nicht in die externe Einlassung.</w:t>
+        <w:t>Nur die erste Ebene darf ohne Einschränkung in die Gemeindeunterlage, das Bank-DD-Paket oder die Bürgerkommunikation. Die zweite Ebene kann als offener Prüfstand mit Terminen dargestellt werden. Die dritte Ebene gehört in die interne Risikodiskussion der Geschäftsführung, nicht in Außenschreiben an Gemeinde, Presse oder Banken.</w:t>
       </w:r>
     </w:p>
     <w:p>
@@ -207,7 +180,7 @@
         <w:jc w:val="left"/>
       </w:pPr>
       <w:r>
-        <w:t>Die Gegenseite wird voraussichtlich nicht nur einen Einzelfehler behaupten, sondern ein Organisationsdefizit. Sie wird sagen, die Mandantenseite habe nicht dokumentiert, nicht rechtzeitig geprüft oder die rechtliche Einordnung bewusst offengelassen. Diese Gegenposition ist ernst zu nehmen, weil sie oft weniger am einzelnen Dokument als an der Gesamterscheinung der Akte ansetzt.</w:t>
+        <w:t>Die Gegenseite — Einwender vom Reiterhof, die Bürgerinitiative mit dem noch unbelegten Kiebitz-Hinweis, kritische Gemeindevertreter und im Zweifel auch die Konsortialbanken — wird voraussichtlich nicht nur einen Einzelfehler behaupten, sondern ein Organisationsdefizit: widersprüchliche Datenraumangaben zu Zellchemie, Temperaturverhalten, Remote Access und Ersatzteilverfügbarkeit, ein auf Zuruf verschobenes Cyber- und Umweltprogramm und eine Kommunikation, die mehr verspricht, als die Technik trägt. Diese Gegenposition ist ernst zu nehmen, weil sie weniger am einzelnen Dokument als an der Gesamterscheinung der Akte ansetzt.</w:t>
       </w:r>
     </w:p>
     <w:p>
@@ -215,7 +188,7 @@
         <w:jc w:val="left"/>
       </w:pPr>
       <w:r>
-        <w:t>Dagegen hilft keine schroffe Abwehrformel. Besser ist eine nüchterne Darstellung: Was ist belegt? Was wird geprüft? Was wurde korrigiert? Was wird bestritten? Welche rechtliche Wertung bleibt vorbehalten?</w:t>
+        <w:t>Dagegen hilft keine schroffe Abwehrformel. Besser ist eine nüchterne Darstellung: Belegt sind Standort, Trassennähe, geplante Anschlussleistung und Speicherkapazität. Geprüft werden Bebauungsplan, Sonderbau-Einordnung, Emissionen und Betriebsstunden der acht Dieselgeneratoren sowie der KRITIS-Scope. Korrigiert wurden die Drei-Tage-Formulierung und die Löschwasserfolie mit dem Dorfteich. Bestritten wird die pauschale Behauptung einer 'Stromverseuchung'. Vorbehalten bleibt die abschließende Bewertung von Netzentgelten, Umlagen und Erlösmodell.</w:t>
       </w:r>
     </w:p>
     <w:p>
@@ -242,7 +215,7 @@
         <w:pStyle w:val="ListNumber"/>
       </w:pPr>
       <w:r>
-        <w:t>Originalunterlagen sichern und nummerieren.</w:t>
+        <w:t>Verbindliche Netzanschlussanfrage beim Übertragungsnetzbetreiber stellen und die Netzverträglichkeitsstudie über 875.000 EUR fristgerecht zum 31.07.2026 beauftragen.</w:t>
       </w:r>
     </w:p>
     <w:p>
@@ -250,7 +223,7 @@
         <w:pStyle w:val="ListNumber"/>
       </w:pPr>
       <w:r>
-        <w:t>Fristenkalender mit Verantwortlichkeit erstellen.</w:t>
+        <w:t>Fristenkalender mit Verantwortlichen nach dem Risikoregister führen: Netzanschluss bei Nils, Brandschutz und Dieselgeneratoren bei Malte, Cyber und KRITIS bei Soraya, Kommunikation bei Theresia.</w:t>
       </w:r>
     </w:p>
     <w:p>
@@ -258,7 +231,7 @@
         <w:pStyle w:val="ListNumber"/>
       </w:pPr>
       <w:r>
-        <w:t>Eine kurze Außenantwort vorbereiten, die Eingang bestätigt und Prüfstand strukturiert.</w:t>
+        <w:t>Die von der Gemeinde erbetene Unterlage zu Brandschutz, Verkehr und Gewerbesteuer vorbereiten; sie bestätigt den Sachstand und strukturiert die offenen Prüfpunkte, ohne Zusagen vorwegzunehmen.</w:t>
       </w:r>
     </w:p>
     <w:p>
@@ -266,7 +239,7 @@
         <w:pStyle w:val="ListNumber"/>
       </w:pPr>
       <w:r>
-        <w:t>Intern ein Langmemo mit Risikoampel führen.</w:t>
+        <w:t>Intern ein Langmemo mit Risikoampel fortschreiben: Netzanschluss und Brandschutz/Havarie rot; KRITIS-Scope, Kommunikation und Dieselgenehmigung orange.</w:t>
       </w:r>
     </w:p>
     <w:p>
@@ -274,7 +247,7 @@
         <w:pStyle w:val="ListNumber"/>
       </w:pPr>
       <w:r>
-        <w:t>Nach Aktenvervollständigung eine endgültige Stellungnahme verfassen.</w:t>
+        <w:t>Nach Eingang von Battery-Management-System-Manual, Zellchemie- und Brandlastnachweis, Löschmittelverträglichkeit und Havariebeckenberechnung die endgültige Stellungnahme verfassen.</w:t>
       </w:r>
     </w:p>
     <w:p>
@@ -282,7 +255,7 @@
         <w:pStyle w:val="ListNumber"/>
       </w:pPr>
       <w:r>
-        <w:t>Bei Vergleichs- oder Behördenkontakt nur vorher freigegebene Tatsachen verwenden.</w:t>
+        <w:t>Gegenüber Ministerium, Gemeinde und Presse nur freigegebene Tatsachen verwenden: 1,8 GW Anschlussleistung, 9,6 GWh Kapazität, Systemdienstleistungs- und Resilienzfunktion — keine Drei-Tage-Alleinversorgung Berlins.</w:t>
       </w:r>
     </w:p>
     <w:p>
@@ -301,13 +274,7 @@
         <w:jc w:val="left"/>
       </w:pPr>
       <w:r>
-        <w:rPr>
-          <w:b/>
-        </w:rPr>
-        <w:t>Option A: defensive Minimalantwort.</w:t>
-      </w:r>
-      <w:r>
-        <w:t xml:space="preserve"> Vorteil: geringe Selbstbelastung, schnelle Fristwahrung. Nachteil: wirkt ausweichend, wenn die Gegenseite konkrete Belege erwartet.</w:t>
+        <w:t>Option A: defensive Minimalantwort an Gemeinde und Presse. Vorteil: geringe Selbstbindung, schnelle Erledigung vor dem Ministeriumstermin am 17.06.2026. Nachteil: wirkt ausweichend, nachdem die Feuerwehr erklärt hat, ohne Sicherheitskonzept gebe es keine belastbare Bauantragslage, und die lokale Zeitung bereits nach der Gefährlichkeit der Containeranlage neben dem Reiterhof fragt.</w:t>
       </w:r>
     </w:p>
     <w:p>
@@ -315,13 +282,7 @@
         <w:jc w:val="left"/>
       </w:pPr>
       <w:r>
-        <w:rPr>
-          <w:b/>
-        </w:rPr>
-        <w:t>Option B: strukturierte Teiloffenlegung.</w:t>
-      </w:r>
-      <w:r>
-        <w:t xml:space="preserve"> Vorteil: glaubwürdig und kooperativ, ohne die Rechtsposition aufzugeben. Nachteil: benötigt saubere interne Abstimmung.</w:t>
+        <w:t>Option B: strukturierte Teiloffenlegung. Die gesicherten Eckdaten — Standort, Trassennähe, Anschlussleistung, Speicherkapazität, Verfahrensstand — werden offengelegt; die offenen Punkte (Netzanschlusszusage, Zellchemie, Löschwasserkonzept, KRITIS-Scope) werden als Prüfprogramm mit Terminen benannt. Vorteil: glaubwürdig gegenüber Gemeinde, Feuerwehr und Banken, ohne die Rechtsposition aufzugeben. Nachteil: benötigt saubere Abstimmung zwischen Projektleitung, Hersteller und den drei Gesellschaftern.</w:t>
       </w:r>
     </w:p>
     <w:p>
@@ -329,13 +290,7 @@
         <w:jc w:val="left"/>
       </w:pPr>
       <w:r>
-        <w:rPr>
-          <w:b/>
-        </w:rPr>
-        <w:t>Option C: umfassende Stellungnahme.</w:t>
-      </w:r>
-      <w:r>
-        <w:t xml:space="preserve"> Vorteil: kann Verfahren beenden oder Vertrauen herstellen. Nachteil: hohes Risiko, wenn Unterlagen noch Lücken haben.</w:t>
+        <w:t>Option C: umfassende Stellungnahme einschließlich Erlösmodell und Technik. Vorteil: könnte die geforderte Bürgerversammlung und die Bank-DD zugleich bedienen. Nachteil: hohes Risiko, solange der Datenraum bei Zellchemie, Temperaturverhalten, Remote Access und Ersatzteilzusagen widersprüchlich ist.</w:t>
       </w:r>
     </w:p>
     <w:p>
@@ -343,7 +298,7 @@
         <w:jc w:val="left"/>
       </w:pPr>
       <w:r>
-        <w:t>Derzeit ist Option B vorzugswürdig. Sie erlaubt Kontrolle über die Erzählung, vermeidet unnötige Anerkenntnisse und zwingt die Akte in eine belastbare Ordnung.</w:t>
+        <w:t>Derzeit ist Option B vorzugswürdig. Sie erlaubt Kontrolle über die Darstellung der Systemfunktion, vermeidet Festlegungen auf unbelegte Herstellerangaben und zwingt die Akte vor Gate 2 in eine belastbare Ordnung.</w:t>
       </w:r>
     </w:p>
     <w:p>
@@ -362,7 +317,7 @@
         <w:pStyle w:val="ListBullet"/>
       </w:pPr>
       <w:r>
-        <w:t>finale Vertrags-/Bescheid-/Beschlussfassung mit Datum;</w:t>
+        <w:t>unterzeichnete Fassung der Grundstückssicherung über die Flurstücke 144/3, 144/8 und 145/2 mit Datum und Laufzeit;</w:t>
       </w:r>
     </w:p>
     <w:p>
@@ -370,7 +325,7 @@
         <w:pStyle w:val="ListBullet"/>
       </w:pPr>
       <w:r>
-        <w:t>Zugangsnachweis;</w:t>
+        <w:t>Zugangsnachweis für die der Gemeinde zugesagte Unterlage zu Brandschutz, Verkehr und Gewerbesteuer;</w:t>
       </w:r>
     </w:p>
     <w:p>
@@ -378,7 +333,7 @@
         <w:pStyle w:val="ListBullet"/>
       </w:pPr>
       <w:r>
-        <w:t>Liste der entscheidungsbefugten Personen;</w:t>
+        <w:t>Liste der entscheidungsbefugten Personen bei der Märkische Reserve Süd GmbH und den Gesellschaftern Brandenburger Infrastrukturholding GmbH, Stadtwerke Spreebogen AG und North Sea Storage Fund SCSp;</w:t>
       </w:r>
     </w:p>
     <w:p>
@@ -386,7 +341,7 @@
         <w:pStyle w:val="ListBullet"/>
       </w:pPr>
       <w:r>
-        <w:t>interne Freigabehistorie;</w:t>
+        <w:t>interne Freigabehistorie der Präsentationsfolie 'Schwarzstart Berlin' und der Drei-Tage-Aussage zur Berliner Versorgung;</w:t>
       </w:r>
     </w:p>
     <w:p>
@@ -394,7 +349,7 @@
         <w:pStyle w:val="ListBullet"/>
       </w:pPr>
       <w:r>
-        <w:t>Zahlenbasis;</w:t>
+        <w:t>Zahlenbasis des Erlösmodells aus Regelenergie, Intraday-Arbitrage und Redispatch-Nähe ohne politische Grundlast-Annahme;</w:t>
       </w:r>
     </w:p>
     <w:p>
@@ -402,7 +357,7 @@
         <w:pStyle w:val="ListBullet"/>
       </w:pPr>
       <w:r>
-        <w:t>technische oder fachliche Anlage;</w:t>
+        <w:t>endgültiges Battery-Management-System-Manual, Zellchemie- und Brandlastnachweis, Löschmittelverträglichkeit und Havariebeckenberechnung;</w:t>
       </w:r>
     </w:p>
     <w:p>
@@ -410,7 +365,7 @@
         <w:pStyle w:val="ListBullet"/>
       </w:pPr>
       <w:r>
-        <w:t>Nachweis, ob eine frühere Fassung abgelöst wurde.</w:t>
+        <w:t>Nachweis, ob die Herstellerpräsentation durch die abweichende technische Anlage im Datenraum abgelöst wurde.</w:t>
       </w:r>
     </w:p>
     <w:p>
@@ -429,7 +384,7 @@
         <w:jc w:val="left"/>
       </w:pPr>
       <w:r>
-        <w:t>Die Akte ist bearbeitbar, aber noch nicht entscheidungsreif. Ein juristisch guter nächster Schritt ist eine knappe, kontrollierte Außenkommunikation und parallel eine harte interne Beweisordnung. Erst danach sollte die endgültige rechtliche Bewertung ausgegeben werden.</w:t>
+        <w:t>Die Akte ist bearbeitbar, aber noch nicht entscheidungsreif für Gate 2. Ein juristisch guter nächster Schritt ist die knappe, kontrollierte Unterlage an die Gemeinde und parallel eine harte interne Beweisordnung: verbindliche Netzanschlussanfrage, Abarbeitung der Feuerwehr-Nachforderungen, Klärung des KRITIS-Scopes und Bereinigung der Datenraumwidersprüche. Erst danach sollte die endgültige rechtliche Bewertung an Geschäftsführung, Gesellschafter und Banken ausgegeben werden.</w:t>
       </w:r>
     </w:p>
     <w:sectPr>

</xml_diff>